<commit_message>
Implement cross-tab session syncing via window storage listener and resolve syntax error
</commit_message>
<xml_diff>
--- a/assets/TEASER COPY 2026 MASTER DOC.docx
+++ b/assets/TEASER COPY 2026 MASTER DOC.docx
@@ -63,6 +63,858 @@
           <w:bCs/>
           <w:highlight w:val="yellow"/>
         </w:rPr>
+        <w:t>7 JUNE 2026</w:t>
+      </w:r>
+    </w:p>
+    <w:p>
+      <w:pPr>
+        <w:rPr>
+          <w:rFonts w:eastAsiaTheme="majorEastAsia" w:cs="Calibri"/>
+          <w:color w:val="0F4761" w:themeColor="accent1" w:themeShade="BF"/>
+          <w:sz w:val="28"/>
+          <w:szCs w:val="28"/>
+          <w:highlight w:val="cyan"/>
+        </w:rPr>
+      </w:pPr>
+    </w:p>
+    <w:p>
+      <w:pPr>
+        <w:rPr>
+          <w:rFonts w:eastAsiaTheme="majorEastAsia" w:cs="Calibri"/>
+          <w:color w:val="0F4761" w:themeColor="accent1" w:themeShade="BF"/>
+          <w:sz w:val="28"/>
+          <w:szCs w:val="28"/>
+          <w:highlight w:val="cyan"/>
+        </w:rPr>
+      </w:pPr>
+      <w:r>
+        <w:rPr>
+          <w:rFonts w:eastAsiaTheme="majorEastAsia" w:cs="Calibri"/>
+          <w:color w:val="0F4761" w:themeColor="accent1" w:themeShade="BF"/>
+          <w:sz w:val="28"/>
+          <w:szCs w:val="28"/>
+          <w:highlight w:val="cyan"/>
+        </w:rPr>
+        <w:t xml:space="preserve">KIRSTENBOSCH COLLAPSE </w:t>
+      </w:r>
+    </w:p>
+    <w:p>
+      <w:pPr>
+        <w:rPr>
+          <w:rFonts w:eastAsiaTheme="majorEastAsia" w:cs="Calibri"/>
+          <w:color w:val="0F4761" w:themeColor="accent1" w:themeShade="BF"/>
+          <w:sz w:val="28"/>
+          <w:szCs w:val="28"/>
+          <w:highlight w:val="cyan"/>
+        </w:rPr>
+      </w:pPr>
+    </w:p>
+    <w:p>
+      <w:pPr>
+        <w:rPr>
+          <w:rFonts w:eastAsiaTheme="majorEastAsia" w:cs="Calibri"/>
+          <w:color w:val="0F4761" w:themeColor="accent1" w:themeShade="BF"/>
+          <w:sz w:val="28"/>
+          <w:szCs w:val="28"/>
+        </w:rPr>
+      </w:pPr>
+      <w:r>
+        <w:rPr>
+          <w:rFonts w:eastAsiaTheme="majorEastAsia" w:cs="Calibri"/>
+          <w:color w:val="0F4761" w:themeColor="accent1" w:themeShade="BF"/>
+          <w:sz w:val="28"/>
+          <w:szCs w:val="28"/>
+        </w:rPr>
+        <w:t>I</w:t>
+      </w:r>
+      <w:r>
+        <w:rPr>
+          <w:rFonts w:eastAsiaTheme="majorEastAsia" w:cs="Calibri"/>
+          <w:color w:val="0F4761" w:themeColor="accent1" w:themeShade="BF"/>
+          <w:sz w:val="28"/>
+          <w:szCs w:val="28"/>
+        </w:rPr>
+        <w:t>t’s an iconic landmark with a proud history.</w:t>
+      </w:r>
+      <w:r>
+        <w:rPr>
+          <w:rFonts w:eastAsiaTheme="majorEastAsia" w:cs="Calibri"/>
+          <w:color w:val="0F4761" w:themeColor="accent1" w:themeShade="BF"/>
+          <w:sz w:val="28"/>
+          <w:szCs w:val="28"/>
+        </w:rPr>
+        <w:t xml:space="preserve"> </w:t>
+      </w:r>
+      <w:r>
+        <w:rPr>
+          <w:rFonts w:eastAsiaTheme="majorEastAsia" w:cs="Calibri"/>
+          <w:color w:val="0F4761" w:themeColor="accent1" w:themeShade="BF"/>
+          <w:sz w:val="28"/>
+          <w:szCs w:val="28"/>
+        </w:rPr>
+        <w:t>Now</w:t>
+      </w:r>
+      <w:r>
+        <w:rPr>
+          <w:rFonts w:eastAsiaTheme="majorEastAsia" w:cs="Calibri"/>
+          <w:color w:val="0F4761" w:themeColor="accent1" w:themeShade="BF"/>
+          <w:sz w:val="28"/>
+          <w:szCs w:val="28"/>
+        </w:rPr>
+        <w:t>, it’s</w:t>
+      </w:r>
+      <w:r>
+        <w:rPr>
+          <w:rFonts w:eastAsiaTheme="majorEastAsia" w:cs="Calibri"/>
+          <w:color w:val="0F4761" w:themeColor="accent1" w:themeShade="BF"/>
+          <w:sz w:val="28"/>
+          <w:szCs w:val="28"/>
+        </w:rPr>
+        <w:t xml:space="preserve"> the centre of controversy.</w:t>
+      </w:r>
+      <w:r>
+        <w:rPr>
+          <w:rFonts w:eastAsiaTheme="majorEastAsia" w:cs="Calibri"/>
+          <w:color w:val="0F4761" w:themeColor="accent1" w:themeShade="BF"/>
+          <w:sz w:val="28"/>
+          <w:szCs w:val="28"/>
+        </w:rPr>
+        <w:t xml:space="preserve"> </w:t>
+      </w:r>
+      <w:r>
+        <w:rPr>
+          <w:rFonts w:eastAsiaTheme="majorEastAsia" w:cs="Calibri"/>
+          <w:color w:val="0F4761" w:themeColor="accent1" w:themeShade="BF"/>
+          <w:sz w:val="28"/>
+          <w:szCs w:val="28"/>
+        </w:rPr>
+        <w:t>What’s really happening behind the scenes at Kirstenbosch?</w:t>
+      </w:r>
+    </w:p>
+    <w:p>
+      <w:pPr>
+        <w:rPr>
+          <w:rFonts w:eastAsiaTheme="majorEastAsia" w:cs="Calibri"/>
+          <w:color w:val="0F4761" w:themeColor="accent1" w:themeShade="BF"/>
+          <w:sz w:val="28"/>
+          <w:szCs w:val="28"/>
+        </w:rPr>
+      </w:pPr>
+    </w:p>
+    <w:p>
+      <w:pPr>
+        <w:rPr>
+          <w:rFonts w:eastAsiaTheme="majorEastAsia" w:cs="Calibri"/>
+          <w:color w:val="0F4761" w:themeColor="accent1" w:themeShade="BF"/>
+          <w:sz w:val="28"/>
+          <w:szCs w:val="28"/>
+        </w:rPr>
+      </w:pPr>
+      <w:r>
+        <w:rPr>
+          <w:rFonts w:eastAsiaTheme="majorEastAsia" w:cs="Calibri"/>
+          <w:color w:val="0F4761" w:themeColor="accent1" w:themeShade="BF"/>
+          <w:sz w:val="28"/>
+          <w:szCs w:val="28"/>
+        </w:rPr>
+        <w:t>A viral post strikes a nerve.</w:t>
+      </w:r>
+      <w:r>
+        <w:rPr>
+          <w:rFonts w:eastAsiaTheme="majorEastAsia" w:cs="Calibri"/>
+          <w:color w:val="0F4761" w:themeColor="accent1" w:themeShade="BF"/>
+          <w:sz w:val="28"/>
+          <w:szCs w:val="28"/>
+        </w:rPr>
+        <w:t xml:space="preserve"> </w:t>
+      </w:r>
+      <w:r>
+        <w:rPr>
+          <w:rFonts w:eastAsiaTheme="majorEastAsia" w:cs="Calibri"/>
+          <w:color w:val="0F4761" w:themeColor="accent1" w:themeShade="BF"/>
+          <w:sz w:val="28"/>
+          <w:szCs w:val="28"/>
+        </w:rPr>
+        <w:t>Claims of neglect, collapsing management and disappearing morale.</w:t>
+      </w:r>
+      <w:r>
+        <w:rPr>
+          <w:rFonts w:eastAsiaTheme="majorEastAsia" w:cs="Calibri"/>
+          <w:color w:val="0F4761" w:themeColor="accent1" w:themeShade="BF"/>
+          <w:sz w:val="28"/>
+          <w:szCs w:val="28"/>
+        </w:rPr>
+        <w:t xml:space="preserve"> </w:t>
+      </w:r>
+      <w:r>
+        <w:rPr>
+          <w:rFonts w:eastAsiaTheme="majorEastAsia" w:cs="Calibri"/>
+          <w:color w:val="0F4761" w:themeColor="accent1" w:themeShade="BF"/>
+          <w:sz w:val="28"/>
+          <w:szCs w:val="28"/>
+        </w:rPr>
+        <w:t>Is a national treasure in decline?</w:t>
+      </w:r>
+    </w:p>
+    <w:p>
+      <w:pPr>
+        <w:rPr>
+          <w:rFonts w:eastAsiaTheme="majorEastAsia" w:cs="Calibri"/>
+          <w:color w:val="0F4761" w:themeColor="accent1" w:themeShade="BF"/>
+          <w:sz w:val="28"/>
+          <w:szCs w:val="28"/>
+        </w:rPr>
+      </w:pPr>
+    </w:p>
+    <w:p>
+      <w:pPr>
+        <w:rPr>
+          <w:rFonts w:eastAsiaTheme="majorEastAsia" w:cs="Calibri"/>
+          <w:color w:val="0F4761" w:themeColor="accent1" w:themeShade="BF"/>
+          <w:sz w:val="28"/>
+          <w:szCs w:val="28"/>
+        </w:rPr>
+      </w:pPr>
+      <w:r>
+        <w:rPr>
+          <w:rFonts w:eastAsiaTheme="majorEastAsia" w:cs="Calibri"/>
+          <w:color w:val="0F4761" w:themeColor="accent1" w:themeShade="BF"/>
+          <w:sz w:val="28"/>
+          <w:szCs w:val="28"/>
+        </w:rPr>
+        <w:t>Rare collections disappearing</w:t>
+      </w:r>
+      <w:r>
+        <w:rPr>
+          <w:rFonts w:eastAsiaTheme="majorEastAsia" w:cs="Calibri"/>
+          <w:color w:val="0F4761" w:themeColor="accent1" w:themeShade="BF"/>
+          <w:sz w:val="28"/>
+          <w:szCs w:val="28"/>
+        </w:rPr>
+        <w:t xml:space="preserve">, </w:t>
+      </w:r>
+      <w:r>
+        <w:rPr>
+          <w:rFonts w:eastAsiaTheme="majorEastAsia" w:cs="Calibri"/>
+          <w:color w:val="0F4761" w:themeColor="accent1" w:themeShade="BF"/>
+          <w:sz w:val="28"/>
+          <w:szCs w:val="28"/>
+        </w:rPr>
+        <w:t>knowledge lost</w:t>
+      </w:r>
+      <w:r>
+        <w:rPr>
+          <w:rFonts w:eastAsiaTheme="majorEastAsia" w:cs="Calibri"/>
+          <w:color w:val="0F4761" w:themeColor="accent1" w:themeShade="BF"/>
+          <w:sz w:val="28"/>
+          <w:szCs w:val="28"/>
+        </w:rPr>
+        <w:t xml:space="preserve">, </w:t>
+      </w:r>
+      <w:r>
+        <w:rPr>
+          <w:rFonts w:eastAsiaTheme="majorEastAsia" w:cs="Calibri"/>
+          <w:color w:val="0F4761" w:themeColor="accent1" w:themeShade="BF"/>
+          <w:sz w:val="28"/>
+          <w:szCs w:val="28"/>
+        </w:rPr>
+        <w:t>standards slipping</w:t>
+      </w:r>
+      <w:r>
+        <w:rPr>
+          <w:rFonts w:eastAsiaTheme="majorEastAsia" w:cs="Calibri"/>
+          <w:color w:val="0F4761" w:themeColor="accent1" w:themeShade="BF"/>
+          <w:sz w:val="28"/>
+          <w:szCs w:val="28"/>
+        </w:rPr>
+        <w:t xml:space="preserve">… </w:t>
+      </w:r>
+      <w:r>
+        <w:rPr>
+          <w:rFonts w:eastAsiaTheme="majorEastAsia" w:cs="Calibri"/>
+          <w:color w:val="0F4761" w:themeColor="accent1" w:themeShade="BF"/>
+          <w:sz w:val="28"/>
+          <w:szCs w:val="28"/>
+        </w:rPr>
+        <w:t xml:space="preserve">Allegations that something is not right inside </w:t>
+      </w:r>
+      <w:r>
+        <w:rPr>
+          <w:rFonts w:eastAsiaTheme="majorEastAsia" w:cs="Calibri"/>
+          <w:color w:val="0F4761" w:themeColor="accent1" w:themeShade="BF"/>
+          <w:sz w:val="28"/>
+          <w:szCs w:val="28"/>
+        </w:rPr>
+        <w:t xml:space="preserve">Kirstenbosch Botanical Garden. </w:t>
+      </w:r>
+    </w:p>
+    <w:p>
+      <w:pPr>
+        <w:rPr>
+          <w:rFonts w:eastAsiaTheme="majorEastAsia" w:cs="Calibri"/>
+          <w:color w:val="0F4761" w:themeColor="accent1" w:themeShade="BF"/>
+          <w:sz w:val="28"/>
+          <w:szCs w:val="28"/>
+        </w:rPr>
+      </w:pPr>
+    </w:p>
+    <w:p>
+      <w:pPr>
+        <w:rPr>
+          <w:rFonts w:eastAsiaTheme="majorEastAsia" w:cs="Calibri"/>
+          <w:color w:val="0F4761" w:themeColor="accent1" w:themeShade="BF"/>
+          <w:sz w:val="28"/>
+          <w:szCs w:val="28"/>
+        </w:rPr>
+      </w:pPr>
+      <w:r>
+        <w:rPr>
+          <w:rFonts w:eastAsiaTheme="majorEastAsia" w:cs="Calibri"/>
+          <w:color w:val="0F4761" w:themeColor="accent1" w:themeShade="BF"/>
+          <w:sz w:val="28"/>
+          <w:szCs w:val="28"/>
+        </w:rPr>
+        <w:t>A haven of natural beauty and diversity</w:t>
+      </w:r>
+      <w:r>
+        <w:rPr>
+          <w:rFonts w:eastAsiaTheme="majorEastAsia" w:cs="Calibri"/>
+          <w:color w:val="0F4761" w:themeColor="accent1" w:themeShade="BF"/>
+          <w:sz w:val="28"/>
+          <w:szCs w:val="28"/>
+        </w:rPr>
+        <w:t xml:space="preserve"> is n</w:t>
+      </w:r>
+      <w:r>
+        <w:rPr>
+          <w:rFonts w:eastAsiaTheme="majorEastAsia" w:cs="Calibri"/>
+          <w:color w:val="0F4761" w:themeColor="accent1" w:themeShade="BF"/>
+          <w:sz w:val="28"/>
+          <w:szCs w:val="28"/>
+        </w:rPr>
+        <w:t>ow weathering claims of bureaucratic paralysis and declining standards.</w:t>
+      </w:r>
+      <w:r>
+        <w:rPr>
+          <w:rFonts w:eastAsiaTheme="majorEastAsia" w:cs="Calibri"/>
+          <w:color w:val="0F4761" w:themeColor="accent1" w:themeShade="BF"/>
+          <w:sz w:val="28"/>
+          <w:szCs w:val="28"/>
+        </w:rPr>
+        <w:t xml:space="preserve"> </w:t>
+      </w:r>
+      <w:r>
+        <w:rPr>
+          <w:rFonts w:eastAsiaTheme="majorEastAsia" w:cs="Calibri"/>
+          <w:color w:val="0F4761" w:themeColor="accent1" w:themeShade="BF"/>
+          <w:sz w:val="28"/>
+          <w:szCs w:val="28"/>
+        </w:rPr>
+        <w:t>What does the future hold for Kirstenbosch?</w:t>
+      </w:r>
+    </w:p>
+    <w:p>
+      <w:pPr>
+        <w:rPr>
+          <w:rFonts w:eastAsiaTheme="majorEastAsia" w:cs="Calibri"/>
+          <w:color w:val="0F4761" w:themeColor="accent1" w:themeShade="BF"/>
+          <w:sz w:val="28"/>
+          <w:szCs w:val="28"/>
+        </w:rPr>
+      </w:pPr>
+    </w:p>
+    <w:p>
+      <w:pPr>
+        <w:rPr>
+          <w:rFonts w:eastAsiaTheme="majorEastAsia" w:cs="Calibri"/>
+          <w:color w:val="0F4761" w:themeColor="accent1" w:themeShade="BF"/>
+          <w:sz w:val="28"/>
+          <w:szCs w:val="28"/>
+        </w:rPr>
+      </w:pPr>
+      <w:r>
+        <w:rPr>
+          <w:rFonts w:eastAsiaTheme="majorEastAsia" w:cs="Calibri"/>
+          <w:color w:val="0F4761" w:themeColor="accent1" w:themeShade="BF"/>
+          <w:sz w:val="28"/>
+          <w:szCs w:val="28"/>
+        </w:rPr>
+        <w:t>A viral post</w:t>
+      </w:r>
+      <w:r>
+        <w:rPr>
+          <w:rFonts w:eastAsiaTheme="majorEastAsia" w:cs="Calibri"/>
+          <w:color w:val="0F4761" w:themeColor="accent1" w:themeShade="BF"/>
+          <w:sz w:val="28"/>
+          <w:szCs w:val="28"/>
+        </w:rPr>
+        <w:t xml:space="preserve">, </w:t>
+      </w:r>
+      <w:r>
+        <w:rPr>
+          <w:rFonts w:eastAsiaTheme="majorEastAsia" w:cs="Calibri"/>
+          <w:color w:val="0F4761" w:themeColor="accent1" w:themeShade="BF"/>
+          <w:sz w:val="28"/>
+          <w:szCs w:val="28"/>
+        </w:rPr>
+        <w:t>a raging controversy – the future of a natural treasure at stake.</w:t>
+      </w:r>
+    </w:p>
+    <w:p>
+      <w:pPr>
+        <w:rPr>
+          <w:rFonts w:eastAsiaTheme="majorEastAsia" w:cs="Calibri"/>
+          <w:color w:val="0F4761" w:themeColor="accent1" w:themeShade="BF"/>
+          <w:sz w:val="28"/>
+          <w:szCs w:val="28"/>
+        </w:rPr>
+      </w:pPr>
+    </w:p>
+    <w:p>
+      <w:pPr>
+        <w:rPr>
+          <w:rFonts w:eastAsiaTheme="majorEastAsia" w:cs="Calibri"/>
+          <w:color w:val="0F4761" w:themeColor="accent1" w:themeShade="BF"/>
+          <w:sz w:val="28"/>
+          <w:szCs w:val="28"/>
+          <w:highlight w:val="cyan"/>
+        </w:rPr>
+      </w:pPr>
+      <w:r>
+        <w:rPr>
+          <w:rFonts w:eastAsiaTheme="majorEastAsia" w:cs="Calibri"/>
+          <w:color w:val="0F4761" w:themeColor="accent1" w:themeShade="BF"/>
+          <w:sz w:val="28"/>
+          <w:szCs w:val="28"/>
+          <w:highlight w:val="cyan"/>
+        </w:rPr>
+        <w:t>KILLER MIDWIFE</w:t>
+      </w:r>
+    </w:p>
+    <w:p>
+      <w:pPr>
+        <w:rPr>
+          <w:rFonts w:eastAsiaTheme="majorEastAsia" w:cs="Calibri"/>
+          <w:color w:val="0F4761" w:themeColor="accent1" w:themeShade="BF"/>
+          <w:sz w:val="28"/>
+          <w:szCs w:val="28"/>
+        </w:rPr>
+      </w:pPr>
+    </w:p>
+    <w:p>
+      <w:pPr>
+        <w:rPr>
+          <w:rFonts w:eastAsiaTheme="majorEastAsia" w:cs="Calibri"/>
+          <w:color w:val="0F4761" w:themeColor="accent1" w:themeShade="BF"/>
+          <w:sz w:val="28"/>
+          <w:szCs w:val="28"/>
+        </w:rPr>
+      </w:pPr>
+      <w:r>
+        <w:rPr>
+          <w:rFonts w:eastAsiaTheme="majorEastAsia" w:cs="Calibri"/>
+          <w:color w:val="0F4761" w:themeColor="accent1" w:themeShade="BF"/>
+          <w:sz w:val="28"/>
+          <w:szCs w:val="28"/>
+        </w:rPr>
+        <w:t>For a decade, pregnant women put their trust in he</w:t>
+      </w:r>
+      <w:r>
+        <w:rPr>
+          <w:rFonts w:eastAsiaTheme="majorEastAsia" w:cs="Calibri"/>
+          <w:color w:val="0F4761" w:themeColor="accent1" w:themeShade="BF"/>
+          <w:sz w:val="28"/>
+          <w:szCs w:val="28"/>
+        </w:rPr>
+        <w:t>r, e</w:t>
+      </w:r>
+      <w:r>
+        <w:rPr>
+          <w:rFonts w:eastAsiaTheme="majorEastAsia" w:cs="Calibri"/>
+          <w:color w:val="0F4761" w:themeColor="accent1" w:themeShade="BF"/>
+          <w:sz w:val="28"/>
+          <w:szCs w:val="28"/>
+        </w:rPr>
+        <w:t>ven as reports of malpractice multiplied.</w:t>
+      </w:r>
+      <w:r>
+        <w:rPr>
+          <w:rFonts w:eastAsiaTheme="majorEastAsia" w:cs="Calibri"/>
+          <w:color w:val="0F4761" w:themeColor="accent1" w:themeShade="BF"/>
+          <w:sz w:val="28"/>
+          <w:szCs w:val="28"/>
+        </w:rPr>
+        <w:t xml:space="preserve"> Now, she’s finally sentenced. </w:t>
+      </w:r>
+    </w:p>
+    <w:p>
+      <w:pPr>
+        <w:rPr>
+          <w:rFonts w:eastAsiaTheme="majorEastAsia" w:cs="Calibri"/>
+          <w:color w:val="0F4761" w:themeColor="accent1" w:themeShade="BF"/>
+          <w:sz w:val="28"/>
+          <w:szCs w:val="28"/>
+        </w:rPr>
+      </w:pPr>
+    </w:p>
+    <w:p>
+      <w:pPr>
+        <w:rPr>
+          <w:rFonts w:eastAsiaTheme="majorEastAsia" w:cs="Calibri"/>
+          <w:color w:val="0F4761" w:themeColor="accent1" w:themeShade="BF"/>
+          <w:sz w:val="28"/>
+          <w:szCs w:val="28"/>
+        </w:rPr>
+      </w:pPr>
+      <w:r>
+        <w:rPr>
+          <w:rFonts w:eastAsiaTheme="majorEastAsia" w:cs="Calibri"/>
+          <w:color w:val="0F4761" w:themeColor="accent1" w:themeShade="BF"/>
+          <w:sz w:val="28"/>
+          <w:szCs w:val="28"/>
+        </w:rPr>
+        <w:t>A midwife promised swift, successful home births</w:t>
+      </w:r>
+      <w:r>
+        <w:rPr>
+          <w:rFonts w:eastAsiaTheme="majorEastAsia" w:cs="Calibri"/>
+          <w:color w:val="0F4761" w:themeColor="accent1" w:themeShade="BF"/>
+          <w:sz w:val="28"/>
+          <w:szCs w:val="28"/>
+        </w:rPr>
+        <w:t xml:space="preserve">. Instead, she </w:t>
+      </w:r>
+      <w:r>
+        <w:rPr>
+          <w:rFonts w:eastAsiaTheme="majorEastAsia" w:cs="Calibri"/>
+          <w:color w:val="0F4761" w:themeColor="accent1" w:themeShade="BF"/>
+          <w:sz w:val="28"/>
+          <w:szCs w:val="28"/>
+        </w:rPr>
+        <w:t>left behind a trail of injuries and deaths.</w:t>
+      </w:r>
+      <w:r>
+        <w:rPr>
+          <w:rFonts w:eastAsiaTheme="majorEastAsia" w:cs="Calibri"/>
+          <w:color w:val="0F4761" w:themeColor="accent1" w:themeShade="BF"/>
+          <w:sz w:val="28"/>
+          <w:szCs w:val="28"/>
+        </w:rPr>
+        <w:t xml:space="preserve"> </w:t>
+      </w:r>
+      <w:r>
+        <w:rPr>
+          <w:rFonts w:eastAsiaTheme="majorEastAsia" w:cs="Calibri"/>
+          <w:color w:val="0F4761" w:themeColor="accent1" w:themeShade="BF"/>
+          <w:sz w:val="28"/>
+          <w:szCs w:val="28"/>
+        </w:rPr>
+        <w:t>Now, she faces justice.</w:t>
+      </w:r>
+    </w:p>
+    <w:p>
+      <w:pPr>
+        <w:rPr>
+          <w:rFonts w:eastAsiaTheme="majorEastAsia" w:cs="Calibri"/>
+          <w:color w:val="0F4761" w:themeColor="accent1" w:themeShade="BF"/>
+          <w:sz w:val="28"/>
+          <w:szCs w:val="28"/>
+        </w:rPr>
+      </w:pPr>
+    </w:p>
+    <w:p>
+      <w:pPr>
+        <w:rPr>
+          <w:rFonts w:eastAsiaTheme="majorEastAsia" w:cs="Calibri"/>
+          <w:color w:val="0F4761" w:themeColor="accent1" w:themeShade="BF"/>
+          <w:sz w:val="28"/>
+          <w:szCs w:val="28"/>
+        </w:rPr>
+      </w:pPr>
+      <w:r>
+        <w:rPr>
+          <w:rFonts w:eastAsiaTheme="majorEastAsia" w:cs="Calibri"/>
+          <w:color w:val="0F4761" w:themeColor="accent1" w:themeShade="BF"/>
+          <w:sz w:val="28"/>
+          <w:szCs w:val="28"/>
+        </w:rPr>
+        <w:t>Her l</w:t>
+      </w:r>
+      <w:r>
+        <w:rPr>
+          <w:rFonts w:eastAsiaTheme="majorEastAsia" w:cs="Calibri"/>
+          <w:color w:val="0F4761" w:themeColor="accent1" w:themeShade="BF"/>
+          <w:sz w:val="28"/>
+          <w:szCs w:val="28"/>
+        </w:rPr>
+        <w:t xml:space="preserve">icence revoked, convicted of assault and culpable homicide: a midwife </w:t>
+      </w:r>
+      <w:r>
+        <w:rPr>
+          <w:rFonts w:eastAsiaTheme="majorEastAsia" w:cs="Calibri"/>
+          <w:color w:val="0F4761" w:themeColor="accent1" w:themeShade="BF"/>
+          <w:sz w:val="28"/>
+          <w:szCs w:val="28"/>
+        </w:rPr>
+        <w:t xml:space="preserve">finally </w:t>
+      </w:r>
+      <w:r>
+        <w:rPr>
+          <w:rFonts w:eastAsiaTheme="majorEastAsia" w:cs="Calibri"/>
+          <w:color w:val="0F4761" w:themeColor="accent1" w:themeShade="BF"/>
+          <w:sz w:val="28"/>
+          <w:szCs w:val="28"/>
+        </w:rPr>
+        <w:t>faces justice.</w:t>
+      </w:r>
+    </w:p>
+    <w:p>
+      <w:pPr>
+        <w:rPr>
+          <w:rFonts w:eastAsiaTheme="majorEastAsia" w:cs="Calibri"/>
+          <w:color w:val="0F4761" w:themeColor="accent1" w:themeShade="BF"/>
+          <w:sz w:val="28"/>
+          <w:szCs w:val="28"/>
+        </w:rPr>
+      </w:pPr>
+    </w:p>
+    <w:p>
+      <w:pPr>
+        <w:rPr>
+          <w:rFonts w:eastAsiaTheme="majorEastAsia" w:cs="Calibri"/>
+          <w:color w:val="0F4761" w:themeColor="accent1" w:themeShade="BF"/>
+          <w:sz w:val="28"/>
+          <w:szCs w:val="28"/>
+          <w:highlight w:val="cyan"/>
+        </w:rPr>
+      </w:pPr>
+      <w:r>
+        <w:rPr>
+          <w:rFonts w:eastAsiaTheme="majorEastAsia" w:cs="Calibri"/>
+          <w:color w:val="0F4761" w:themeColor="accent1" w:themeShade="BF"/>
+          <w:sz w:val="28"/>
+          <w:szCs w:val="28"/>
+          <w:highlight w:val="cyan"/>
+        </w:rPr>
+        <w:t xml:space="preserve">FUTURE CLINIC </w:t>
+      </w:r>
+    </w:p>
+    <w:p>
+      <w:pPr>
+        <w:rPr>
+          <w:rFonts w:eastAsiaTheme="majorEastAsia" w:cs="Calibri"/>
+          <w:color w:val="0F4761" w:themeColor="accent1" w:themeShade="BF"/>
+          <w:sz w:val="28"/>
+          <w:szCs w:val="28"/>
+          <w:highlight w:val="cyan"/>
+        </w:rPr>
+      </w:pPr>
+    </w:p>
+    <w:p>
+      <w:pPr>
+        <w:rPr>
+          <w:rFonts w:eastAsiaTheme="majorEastAsia" w:cs="Calibri"/>
+          <w:color w:val="0F4761" w:themeColor="accent1" w:themeShade="BF"/>
+          <w:sz w:val="28"/>
+          <w:szCs w:val="28"/>
+        </w:rPr>
+      </w:pPr>
+      <w:r>
+        <w:rPr>
+          <w:rFonts w:eastAsiaTheme="majorEastAsia" w:cs="Calibri"/>
+          <w:color w:val="0F4761" w:themeColor="accent1" w:themeShade="BF"/>
+          <w:sz w:val="28"/>
+          <w:szCs w:val="28"/>
+        </w:rPr>
+        <w:t>She’s a mother, a rural doctor, and</w:t>
+      </w:r>
+      <w:r>
+        <w:rPr>
+          <w:rFonts w:eastAsiaTheme="majorEastAsia" w:cs="Calibri"/>
+          <w:color w:val="0F4761" w:themeColor="accent1" w:themeShade="BF"/>
+          <w:sz w:val="28"/>
+          <w:szCs w:val="28"/>
+        </w:rPr>
+        <w:t xml:space="preserve"> </w:t>
+      </w:r>
+      <w:r>
+        <w:rPr>
+          <w:rFonts w:eastAsiaTheme="majorEastAsia" w:cs="Calibri"/>
+          <w:color w:val="0F4761" w:themeColor="accent1" w:themeShade="BF"/>
+          <w:sz w:val="28"/>
+          <w:szCs w:val="28"/>
+        </w:rPr>
+        <w:t>a tech pioneer.</w:t>
+      </w:r>
+      <w:r>
+        <w:rPr>
+          <w:rFonts w:eastAsiaTheme="majorEastAsia" w:cs="Calibri"/>
+          <w:color w:val="0F4761" w:themeColor="accent1" w:themeShade="BF"/>
+          <w:sz w:val="28"/>
+          <w:szCs w:val="28"/>
+        </w:rPr>
+        <w:t xml:space="preserve"> </w:t>
+      </w:r>
+      <w:r>
+        <w:rPr>
+          <w:rFonts w:eastAsiaTheme="majorEastAsia" w:cs="Calibri"/>
+          <w:color w:val="0F4761" w:themeColor="accent1" w:themeShade="BF"/>
+          <w:sz w:val="28"/>
+          <w:szCs w:val="28"/>
+        </w:rPr>
+        <w:t>Now</w:t>
+      </w:r>
+      <w:r>
+        <w:rPr>
+          <w:rFonts w:eastAsiaTheme="majorEastAsia" w:cs="Calibri"/>
+          <w:color w:val="0F4761" w:themeColor="accent1" w:themeShade="BF"/>
+          <w:sz w:val="28"/>
+          <w:szCs w:val="28"/>
+        </w:rPr>
+        <w:t>,</w:t>
+      </w:r>
+      <w:r>
+        <w:rPr>
+          <w:rFonts w:eastAsiaTheme="majorEastAsia" w:cs="Calibri"/>
+          <w:color w:val="0F4761" w:themeColor="accent1" w:themeShade="BF"/>
+          <w:sz w:val="28"/>
+          <w:szCs w:val="28"/>
+        </w:rPr>
+        <w:t xml:space="preserve"> she’s helping build a cutting-edge system to reach into areas where healthcare is most needed.</w:t>
+      </w:r>
+    </w:p>
+    <w:p>
+      <w:pPr>
+        <w:rPr>
+          <w:rFonts w:eastAsiaTheme="majorEastAsia" w:cs="Calibri"/>
+          <w:color w:val="0F4761" w:themeColor="accent1" w:themeShade="BF"/>
+          <w:sz w:val="28"/>
+          <w:szCs w:val="28"/>
+        </w:rPr>
+      </w:pPr>
+    </w:p>
+    <w:p>
+      <w:pPr>
+        <w:rPr>
+          <w:rFonts w:eastAsiaTheme="majorEastAsia" w:cs="Calibri"/>
+          <w:color w:val="0F4761" w:themeColor="accent1" w:themeShade="BF"/>
+          <w:sz w:val="28"/>
+          <w:szCs w:val="28"/>
+        </w:rPr>
+      </w:pPr>
+      <w:r>
+        <w:rPr>
+          <w:rFonts w:eastAsiaTheme="majorEastAsia" w:cs="Calibri"/>
+          <w:color w:val="0F4761" w:themeColor="accent1" w:themeShade="BF"/>
+          <w:sz w:val="28"/>
+          <w:szCs w:val="28"/>
+        </w:rPr>
+        <w:lastRenderedPageBreak/>
+        <w:t>Could AI help solve South Africa’s rural healthcare crisis?</w:t>
+      </w:r>
+      <w:r>
+        <w:rPr>
+          <w:rFonts w:eastAsiaTheme="majorEastAsia" w:cs="Calibri"/>
+          <w:color w:val="0F4761" w:themeColor="accent1" w:themeShade="BF"/>
+          <w:sz w:val="28"/>
+          <w:szCs w:val="28"/>
+        </w:rPr>
+        <w:t xml:space="preserve"> We go i</w:t>
+      </w:r>
+      <w:r>
+        <w:rPr>
+          <w:rFonts w:eastAsiaTheme="majorEastAsia" w:cs="Calibri"/>
+          <w:color w:val="0F4761" w:themeColor="accent1" w:themeShade="BF"/>
+          <w:sz w:val="28"/>
+          <w:szCs w:val="28"/>
+        </w:rPr>
+        <w:t>nside the innovation bringing medical support to clinics where no doctor is on call.</w:t>
+      </w:r>
+    </w:p>
+    <w:p>
+      <w:pPr>
+        <w:rPr>
+          <w:rFonts w:eastAsiaTheme="majorEastAsia" w:cs="Calibri"/>
+          <w:color w:val="0F4761" w:themeColor="accent1" w:themeShade="BF"/>
+          <w:sz w:val="28"/>
+          <w:szCs w:val="28"/>
+        </w:rPr>
+      </w:pPr>
+    </w:p>
+    <w:p>
+      <w:pPr>
+        <w:rPr>
+          <w:rFonts w:eastAsiaTheme="majorEastAsia" w:cs="Calibri"/>
+          <w:color w:val="0F4761" w:themeColor="accent1" w:themeShade="BF"/>
+          <w:sz w:val="28"/>
+          <w:szCs w:val="28"/>
+        </w:rPr>
+      </w:pPr>
+      <w:r>
+        <w:rPr>
+          <w:rFonts w:eastAsiaTheme="majorEastAsia" w:cs="Calibri"/>
+          <w:color w:val="0F4761" w:themeColor="accent1" w:themeShade="BF"/>
+          <w:sz w:val="28"/>
+          <w:szCs w:val="28"/>
+        </w:rPr>
+        <w:t>A missed cancer diagnosis. A dangerous prescription caught in time.</w:t>
+      </w:r>
+      <w:r>
+        <w:rPr>
+          <w:rFonts w:eastAsiaTheme="majorEastAsia" w:cs="Calibri"/>
+          <w:color w:val="0F4761" w:themeColor="accent1" w:themeShade="BF"/>
+          <w:sz w:val="28"/>
+          <w:szCs w:val="28"/>
+        </w:rPr>
+        <w:t xml:space="preserve"> </w:t>
+      </w:r>
+      <w:r>
+        <w:rPr>
+          <w:rFonts w:eastAsiaTheme="majorEastAsia" w:cs="Calibri"/>
+          <w:color w:val="0F4761" w:themeColor="accent1" w:themeShade="BF"/>
+          <w:sz w:val="28"/>
+          <w:szCs w:val="28"/>
+        </w:rPr>
+        <w:t>An AI-assisted system is helping rural healthcare workers save lives.</w:t>
+      </w:r>
+    </w:p>
+    <w:p>
+      <w:pPr>
+        <w:rPr>
+          <w:rFonts w:eastAsiaTheme="majorEastAsia" w:cs="Calibri"/>
+          <w:color w:val="0F4761" w:themeColor="accent1" w:themeShade="BF"/>
+          <w:sz w:val="28"/>
+          <w:szCs w:val="28"/>
+        </w:rPr>
+      </w:pPr>
+    </w:p>
+    <w:p>
+      <w:pPr>
+        <w:rPr>
+          <w:rFonts w:eastAsiaTheme="majorEastAsia" w:cs="Calibri"/>
+          <w:color w:val="0F4761" w:themeColor="accent1" w:themeShade="BF"/>
+          <w:sz w:val="28"/>
+          <w:szCs w:val="28"/>
+        </w:rPr>
+      </w:pPr>
+    </w:p>
+    <w:p>
+      <w:pPr>
+        <w:pStyle w:val="Heading1"/>
+        <w:rPr>
+          <w:rFonts w:ascii="Calibri" w:hAnsi="Calibri" w:cs="Calibri"/>
+          <w:b/>
+          <w:bCs/>
+          <w:highlight w:val="yellow"/>
+        </w:rPr>
+      </w:pPr>
+      <w:r>
+        <w:rPr>
+          <w:rFonts w:ascii="Calibri" w:hAnsi="Calibri" w:cs="Calibri"/>
+          <w:b/>
+          <w:bCs/>
+          <w:highlight w:val="yellow"/>
+        </w:rPr>
         <w:t>31 MAY 2026</w:t>
       </w:r>
     </w:p>
@@ -396,7 +1248,6 @@
     <w:p/>
     <w:p>
       <w:r>
-        <w:lastRenderedPageBreak/>
         <w:t xml:space="preserve">A skateboard, a stranger, and a journey that went viral </w:t>
       </w:r>
       <w:r>
@@ -720,16 +1571,131 @@
     <w:p/>
     <w:p>
       <w:pPr>
-        <w:pStyle w:val="Heading2"/>
-      </w:pPr>
-      <w:r>
-        <w:rPr>
-          <w:highlight w:val="magenta"/>
-        </w:rPr>
-        <w:t>FOR LATER</w:t>
-      </w:r>
-      <w:r>
-        <w:t xml:space="preserve"> </w:t>
+        <w:pStyle w:val="Heading1"/>
+        <w:rPr>
+          <w:rFonts w:ascii="Calibri" w:hAnsi="Calibri" w:cs="Calibri"/>
+          <w:b/>
+          <w:bCs/>
+          <w:highlight w:val="yellow"/>
+        </w:rPr>
+      </w:pPr>
+      <w:r>
+        <w:rPr>
+          <w:rFonts w:ascii="Calibri" w:hAnsi="Calibri" w:cs="Calibri"/>
+          <w:b/>
+          <w:bCs/>
+          <w:highlight w:val="yellow"/>
+        </w:rPr>
+        <w:t>TBC</w:t>
+      </w:r>
+    </w:p>
+    <w:p>
+      <w:pPr>
+        <w:rPr>
+          <w:highlight w:val="yellow"/>
+        </w:rPr>
+      </w:pPr>
+    </w:p>
+    <w:p>
+      <w:pPr>
+        <w:pStyle w:val="Heading3"/>
+        <w:rPr>
+          <w:color w:val="auto"/>
+          <w:highlight w:val="cyan"/>
+        </w:rPr>
+      </w:pPr>
+      <w:r>
+        <w:rPr>
+          <w:color w:val="auto"/>
+          <w:highlight w:val="cyan"/>
+        </w:rPr>
+        <w:t xml:space="preserve">THIRST TRAP </w:t>
+      </w:r>
+    </w:p>
+    <w:p>
+      <w:pPr>
+        <w:rPr>
+          <w:highlight w:val="yellow"/>
+        </w:rPr>
+      </w:pPr>
+    </w:p>
+    <w:p>
+      <w:r>
+        <w:t>Controversial tenders, allegations of profiteering.</w:t>
+      </w:r>
+      <w:r>
+        <w:t xml:space="preserve"> </w:t>
+      </w:r>
+      <w:r>
+        <w:t>A shadow economy thrives in the wake of a city’s water crisis.</w:t>
+      </w:r>
+    </w:p>
+    <w:p/>
+    <w:p>
+      <w:r>
+        <w:t>Johannesburg is running dry.</w:t>
+      </w:r>
+      <w:r>
+        <w:t xml:space="preserve"> </w:t>
+      </w:r>
+      <w:r>
+        <w:t xml:space="preserve">As ageing </w:t>
+      </w:r>
+      <w:r>
+        <w:t xml:space="preserve">water </w:t>
+      </w:r>
+      <w:r>
+        <w:t>infrastructure collapses</w:t>
+      </w:r>
+      <w:r>
+        <w:t>, i</w:t>
+      </w:r>
+      <w:r>
+        <w:t xml:space="preserve">s a temporary response becoming a </w:t>
+      </w:r>
+      <w:r>
+        <w:t xml:space="preserve">problematic </w:t>
+      </w:r>
+      <w:r>
+        <w:t>permanent solution?</w:t>
+      </w:r>
+    </w:p>
+    <w:p/>
+    <w:p>
+      <w:r>
+        <w:t>What happens when emergency intervention becomes permanent?</w:t>
+      </w:r>
+      <w:r>
+        <w:t xml:space="preserve"> </w:t>
+      </w:r>
+      <w:r>
+        <w:t>Tanker tenders, missing deliveries and infrastructure failures raise questions about Joburg’s water future.</w:t>
+      </w:r>
+    </w:p>
+    <w:p/>
+    <w:p>
+      <w:r>
+        <w:t>Dry taps. Night-time tanker deliveries. Millions in emergency contracts.</w:t>
+      </w:r>
+      <w:r>
+        <w:t xml:space="preserve"> </w:t>
+      </w:r>
+      <w:r>
+        <w:t xml:space="preserve">Who’s cashing in while Joburg </w:t>
+      </w:r>
+      <w:proofErr w:type="gramStart"/>
+      <w:r>
+        <w:t>residents</w:t>
+      </w:r>
+      <w:proofErr w:type="gramEnd"/>
+      <w:r>
+        <w:t xml:space="preserve"> queue for water?</w:t>
+      </w:r>
+    </w:p>
+    <w:p/>
+    <w:p>
+      <w:r>
+        <w:t>The contracts, the discrepancies and the allegations of profiteering behind Joburg’s deepening water crisis.</w:t>
       </w:r>
     </w:p>
     <w:p>
@@ -1113,6 +2079,7 @@
         </w:rPr>
       </w:pPr>
       <w:r>
+        <w:lastRenderedPageBreak/>
         <w:t xml:space="preserve">Has national road safety been left underfunded and neglected while management </w:t>
       </w:r>
       <w:r>
@@ -9530,6 +10497,10 @@
     </w:sectPr>
   </w:body>
 </w:document>
+</file>
+
+<file path=word/numbering.xml><?xml version="1.0" encoding="utf-8"?>
+<w:numbering xmlns:wpc="http://schemas.microsoft.com/office/word/2010/wordprocessingCanvas" xmlns:cx="http://schemas.microsoft.com/office/drawing/2014/chartex" xmlns:cx1="http://schemas.microsoft.com/office/drawing/2015/9/8/chartex" xmlns:cx2="http://schemas.microsoft.com/office/drawing/2015/10/21/chartex" xmlns:cx3="http://schemas.microsoft.com/office/drawing/2016/5/9/chartex" xmlns:cx4="http://schemas.microsoft.com/office/drawing/2016/5/10/chartex" xmlns:cx5="http://schemas.microsoft.com/office/drawing/2016/5/11/chartex" xmlns:cx6="http://schemas.microsoft.com/office/drawing/2016/5/12/chartex" xmlns:cx7="http://schemas.microsoft.com/office/drawing/2016/5/13/chartex" xmlns:cx8="http://schemas.microsoft.com/office/drawing/2016/5/14/chartex" xmlns:mc="http://schemas.openxmlformats.org/markup-compatibility/2006" xmlns:aink="http://schemas.microsoft.com/office/drawing/2016/ink" xmlns:am3d="http://schemas.microsoft.com/office/drawing/2017/model3d" xmlns:o="urn:schemas-microsoft-com:office:office" xmlns:oel="http://schemas.microsoft.com/office/2019/extlst" xmlns:r="http://schemas.openxmlformats.org/officeDocument/2006/relationships" xmlns:m="http://schemas.openxmlformats.org/officeDocument/2006/math" xmlns:v="urn:schemas-microsoft-com:vml" xmlns:wp14="http://schemas.microsoft.com/office/word/2010/wordprocessingDrawing" xmlns:wp="http://schemas.openxmlformats.org/drawingml/2006/wordprocessingDrawing" xmlns:w10="urn:schemas-microsoft-com:office:word" xmlns:w="http://schemas.openxmlformats.org/wordprocessingml/2006/main" xmlns:w14="http://schemas.microsoft.com/office/word/2010/wordml" xmlns:w15="http://schemas.microsoft.com/office/word/2012/wordml" xmlns:w16cex="http://schemas.microsoft.com/office/word/2018/wordml/cex" xmlns:w16cid="http://schemas.microsoft.com/office/word/2016/wordml/cid" xmlns:w16="http://schemas.microsoft.com/office/word/2018/wordml" xmlns:w16du="http://schemas.microsoft.com/office/word/2023/wordml/word16du" xmlns:w16sdtdh="http://schemas.microsoft.com/office/word/2020/wordml/sdtdatahash" xmlns:w16sdtfl="http://schemas.microsoft.com/office/word/2024/wordml/sdtformatlock" xmlns:w16se="http://schemas.microsoft.com/office/word/2015/wordml/symex" xmlns:wpg="http://schemas.microsoft.com/office/word/2010/wordprocessingGroup" xmlns:wpi="http://schemas.microsoft.com/office/word/2010/wordprocessingInk" xmlns:wne="http://schemas.microsoft.com/office/word/2006/wordml" xmlns:wps="http://schemas.microsoft.com/office/word/2010/wordprocessingShape" mc:Ignorable="w14 w15 w16se w16cid w16 w16cex w16sdtdh w16sdtfl w16du wp14"/>
 </file>
 
 <file path=word/styles.xml><?xml version="1.0" encoding="utf-8"?>

</xml_diff>